<commit_message>
Add missing guest book sections and update outline checklist
</commit_message>
<xml_diff>
--- a/docs/Kengs_Landing_Guest_Book.docx
+++ b/docs/Kengs_Landing_Guest_Book.docx
@@ -2091,6 +2091,246 @@
     </w:p>
     <w:p>
       <w:pPr>
+        <w:spacing w:after="200" w:line="276" w:lineRule="auto"/>
+        <w:rPr>
+          <w:rFonts w:ascii="Arial" w:hAnsi="Arial" w:cs="Arial"/>
+        </w:rPr>
+        <w:pStyle w:val="Heading1"/>
+      </w:pPr>
+      <w:r>
+        <w:rPr>
+          <w:rFonts w:ascii="Arial" w:hAnsi="Arial" w:cs="Arial"/>
+        </w:rPr>
+        <w:t xml:space="preserve">Arriving and Getting In</w:t>
+      </w:r>
+    </w:p>
+    <w:p>
+      <w:pPr>
+        <w:spacing w:after="200" w:line="276" w:lineRule="auto"/>
+        <w:rPr>
+          <w:rFonts w:ascii="Arial" w:hAnsi="Arial" w:cs="Arial"/>
+        </w:rPr>
+        <w:pStyle w:val="Normal"/>
+      </w:pPr>
+      <w:r>
+        <w:rPr>
+          <w:rFonts w:ascii="Arial" w:hAnsi="Arial" w:cs="Arial"/>
+        </w:rPr>
+        <w:t xml:space="preserve">Your check-in instructions, including the door code or lockbox details, will be sent to you via the booking platform before your arrival.</w:t>
+      </w:r>
+    </w:p>
+    <w:p>
+      <w:pPr>
+        <w:spacing w:after="200" w:line="276" w:lineRule="auto"/>
+        <w:rPr>
+          <w:rFonts w:ascii="Arial" w:hAnsi="Arial" w:cs="Arial"/>
+        </w:rPr>
+        <w:pStyle w:val="Normal"/>
+      </w:pPr>
+      <w:r>
+        <w:rPr>
+          <w:rFonts w:ascii="Arial" w:hAnsi="Arial" w:cs="Arial"/>
+        </w:rPr>
+        <w:t xml:space="preserve">If you have trouble getting in or need early check-in, please contact the host and we will do our best to accommodate.</w:t>
+      </w:r>
+    </w:p>
+    <w:p>
+      <w:pPr>
+        <w:spacing w:after="200" w:line="276" w:lineRule="auto"/>
+        <w:rPr>
+          <w:rFonts w:ascii="Arial" w:hAnsi="Arial" w:cs="Arial"/>
+        </w:rPr>
+        <w:pStyle w:val="Heading1"/>
+      </w:pPr>
+      <w:r>
+        <w:rPr>
+          <w:rFonts w:ascii="Arial" w:hAnsi="Arial" w:cs="Arial"/>
+        </w:rPr>
+        <w:t xml:space="preserve">Entertainment and Smart TVs</w:t>
+      </w:r>
+    </w:p>
+    <w:p>
+      <w:pPr>
+        <w:spacing w:after="200" w:line="276" w:lineRule="auto"/>
+        <w:rPr>
+          <w:rFonts w:ascii="Arial" w:hAnsi="Arial" w:cs="Arial"/>
+        </w:rPr>
+        <w:pStyle w:val="Normal"/>
+      </w:pPr>
+      <w:r>
+        <w:rPr>
+          <w:rFonts w:ascii="Arial" w:hAnsi="Arial" w:cs="Arial"/>
+        </w:rPr>
+        <w:t xml:space="preserve">Each room has a Smart TV with access to popular streaming apps including Netflix, Hulu, and Amazon Prime.</w:t>
+      </w:r>
+    </w:p>
+    <w:p>
+      <w:pPr>
+        <w:spacing w:after="200" w:line="276" w:lineRule="auto"/>
+        <w:rPr>
+          <w:rFonts w:ascii="Arial" w:hAnsi="Arial" w:cs="Arial"/>
+        </w:rPr>
+        <w:pStyle w:val="Normal"/>
+      </w:pPr>
+      <w:r>
+        <w:rPr>
+          <w:rFonts w:ascii="Arial" w:hAnsi="Arial" w:cs="Arial"/>
+        </w:rPr>
+        <w:t xml:space="preserve">You can log in to your own streaming accounts. Please remember to log out before checkout.</w:t>
+      </w:r>
+    </w:p>
+    <w:p>
+      <w:pPr>
+        <w:spacing w:after="200" w:line="276" w:lineRule="auto"/>
+        <w:rPr>
+          <w:rFonts w:ascii="Arial" w:hAnsi="Arial" w:cs="Arial"/>
+        </w:rPr>
+        <w:pStyle w:val="Normal"/>
+      </w:pPr>
+      <w:r>
+        <w:rPr>
+          <w:rFonts w:ascii="Arial" w:hAnsi="Arial" w:cs="Arial"/>
+        </w:rPr>
+        <w:t xml:space="preserve">To cast from your phone or laptop, connect to the same Starlink WiFi network and use the built-in casting feature on the TV.</w:t>
+      </w:r>
+    </w:p>
+    <w:p>
+      <w:pPr>
+        <w:spacing w:after="200" w:line="276" w:lineRule="auto"/>
+        <w:rPr>
+          <w:rFonts w:ascii="Arial" w:hAnsi="Arial" w:cs="Arial"/>
+        </w:rPr>
+        <w:pStyle w:val="Heading1"/>
+      </w:pPr>
+      <w:r>
+        <w:rPr>
+          <w:rFonts w:ascii="Arial" w:hAnsi="Arial" w:cs="Arial"/>
+        </w:rPr>
+        <w:t xml:space="preserve">Kitchen and Appliances</w:t>
+      </w:r>
+    </w:p>
+    <w:p>
+      <w:pPr>
+        <w:spacing w:after="200" w:line="276" w:lineRule="auto"/>
+        <w:rPr>
+          <w:rFonts w:ascii="Arial" w:hAnsi="Arial" w:cs="Arial"/>
+        </w:rPr>
+        <w:pStyle w:val="Normal"/>
+      </w:pPr>
+      <w:r>
+        <w:rPr>
+          <w:rFonts w:ascii="Arial" w:hAnsi="Arial" w:cs="Arial"/>
+        </w:rPr>
+        <w:t xml:space="preserve">The kitchen is fully equipped with a stove, oven, microwave, refrigerator, and dishwasher.</w:t>
+      </w:r>
+    </w:p>
+    <w:p>
+      <w:pPr>
+        <w:spacing w:after="200" w:line="276" w:lineRule="auto"/>
+        <w:rPr>
+          <w:rFonts w:ascii="Arial" w:hAnsi="Arial" w:cs="Arial"/>
+        </w:rPr>
+        <w:pStyle w:val="Normal"/>
+      </w:pPr>
+      <w:r>
+        <w:rPr>
+          <w:rFonts w:ascii="Arial" w:hAnsi="Arial" w:cs="Arial"/>
+        </w:rPr>
+        <w:t xml:space="preserve">A coffee maker is available on the counter. Filters and a small supply of coffee are provided.</w:t>
+      </w:r>
+    </w:p>
+    <w:p>
+      <w:pPr>
+        <w:spacing w:after="200" w:line="276" w:lineRule="auto"/>
+        <w:rPr>
+          <w:rFonts w:ascii="Arial" w:hAnsi="Arial" w:cs="Arial"/>
+        </w:rPr>
+        <w:pStyle w:val="Normal"/>
+      </w:pPr>
+      <w:r>
+        <w:rPr>
+          <w:rFonts w:ascii="Arial" w:hAnsi="Arial" w:cs="Arial"/>
+        </w:rPr>
+        <w:t xml:space="preserve">Basic cooking essentials such as oil, salt, pepper, and common spices are stocked for your convenience.</w:t>
+      </w:r>
+    </w:p>
+    <w:p>
+      <w:pPr>
+        <w:spacing w:after="200" w:line="276" w:lineRule="auto"/>
+        <w:rPr>
+          <w:rFonts w:ascii="Arial" w:hAnsi="Arial" w:cs="Arial"/>
+        </w:rPr>
+        <w:pStyle w:val="Normal"/>
+      </w:pPr>
+      <w:r>
+        <w:rPr>
+          <w:rFonts w:ascii="Arial" w:hAnsi="Arial" w:cs="Arial"/>
+        </w:rPr>
+        <w:t xml:space="preserve">If you use the oven or stovetop, please clean up afterward and ensure all burners are turned off.</w:t>
+      </w:r>
+    </w:p>
+    <w:p>
+      <w:pPr>
+        <w:spacing w:after="200" w:line="276" w:lineRule="auto"/>
+        <w:rPr>
+          <w:rFonts w:ascii="Arial" w:hAnsi="Arial" w:cs="Arial"/>
+        </w:rPr>
+        <w:pStyle w:val="Heading1"/>
+      </w:pPr>
+      <w:r>
+        <w:rPr>
+          <w:rFonts w:ascii="Arial" w:hAnsi="Arial" w:cs="Arial"/>
+        </w:rPr>
+        <w:t xml:space="preserve">Climate Control</w:t>
+      </w:r>
+    </w:p>
+    <w:p>
+      <w:pPr>
+        <w:spacing w:after="200" w:line="276" w:lineRule="auto"/>
+        <w:rPr>
+          <w:rFonts w:ascii="Arial" w:hAnsi="Arial" w:cs="Arial"/>
+        </w:rPr>
+        <w:pStyle w:val="Normal"/>
+      </w:pPr>
+      <w:r>
+        <w:rPr>
+          <w:rFonts w:ascii="Arial" w:hAnsi="Arial" w:cs="Arial"/>
+        </w:rPr>
+        <w:t xml:space="preserve">The home has central air conditioning controlled by a thermostat in the hallway. Please set it to a comfortable temperature and avoid setting it below 68°F in summer.</w:t>
+      </w:r>
+    </w:p>
+    <w:p>
+      <w:pPr>
+        <w:spacing w:after="200" w:line="276" w:lineRule="auto"/>
+        <w:rPr>
+          <w:rFonts w:ascii="Arial" w:hAnsi="Arial" w:cs="Arial"/>
+        </w:rPr>
+        <w:pStyle w:val="Normal"/>
+      </w:pPr>
+      <w:r>
+        <w:rPr>
+          <w:rFonts w:ascii="Arial" w:hAnsi="Arial" w:cs="Arial"/>
+        </w:rPr>
+        <w:t xml:space="preserve">A propane heater is available in the living room for cooler evenings. Instructions are posted near the unit. Please turn it off before going to bed or leaving the property.</w:t>
+      </w:r>
+    </w:p>
+    <w:p>
+      <w:pPr>
+        <w:spacing w:after="200" w:line="276" w:lineRule="auto"/>
+        <w:rPr>
+          <w:rFonts w:ascii="Arial" w:hAnsi="Arial" w:cs="Arial"/>
+        </w:rPr>
+        <w:pStyle w:val="Normal"/>
+      </w:pPr>
+      <w:r>
+        <w:rPr>
+          <w:rFonts w:ascii="Arial" w:hAnsi="Arial" w:cs="Arial"/>
+        </w:rPr>
+        <w:t xml:space="preserve">Ceiling fans are available in the bedrooms and living room to help with airflow.</w:t>
+      </w:r>
+    </w:p>
+    <w:p>
+      <w:pPr>
         <w:pStyle w:val="Heading1"/>
         <w:rPr>
           <w:rFonts w:ascii="Arial" w:hAnsi="Arial" w:cs="Arial"/>
@@ -2265,6 +2505,50 @@
     </w:p>
     <w:p>
       <w:pPr>
+        <w:pStyle w:val="ListParagraph"/>
+        <w:numPr>
+          <w:ilvl w:val="0"/>
+          <w:numId w:val="16"/>
+        </w:numPr>
+        <w:rPr>
+          <w:rFonts w:ascii="Arial" w:hAnsi="Arial" w:cs="Arial"/>
+          <w:sz w:val="24"/>
+          <w:szCs w:val="28"/>
+        </w:rPr>
+      </w:pPr>
+      <w:r>
+        <w:rPr>
+          <w:rFonts w:ascii="Arial" w:hAnsi="Arial" w:cs="Arial"/>
+          <w:sz w:val="24"/>
+          <w:szCs w:val="28"/>
+        </w:rPr>
+        <w:t xml:space="preserve">Pets are not permitted unless approved in advance by the host.</w:t>
+      </w:r>
+    </w:p>
+    <w:p>
+      <w:pPr>
+        <w:pStyle w:val="ListParagraph"/>
+        <w:numPr>
+          <w:ilvl w:val="0"/>
+          <w:numId w:val="16"/>
+        </w:numPr>
+        <w:rPr>
+          <w:rFonts w:ascii="Arial" w:hAnsi="Arial" w:cs="Arial"/>
+          <w:sz w:val="24"/>
+          <w:szCs w:val="28"/>
+        </w:rPr>
+      </w:pPr>
+      <w:r>
+        <w:rPr>
+          <w:rFonts w:ascii="Arial" w:hAnsi="Arial" w:cs="Arial"/>
+          <w:sz w:val="24"/>
+          <w:szCs w:val="28"/>
+        </w:rPr>
+        <w:t xml:space="preserve">Please keep noise to a minimum between 10:00 PM and 7:00 AM out of respect for the peaceful setting.</w:t>
+      </w:r>
+    </w:p>
+    <w:p>
+      <w:pPr>
         <w:pStyle w:val="Heading1"/>
         <w:rPr>
           <w:rFonts w:ascii="Arial" w:hAnsi="Arial" w:cs="Arial"/>
@@ -2436,6 +2720,89 @@
           <w:rFonts w:ascii="Arial" w:hAnsi="Arial" w:cs="Arial"/>
         </w:rPr>
       </w:pPr>
+      <w:r>
+        <w:rPr>
+          <w:rFonts w:ascii="Arial" w:hAnsi="Arial" w:cs="Arial"/>
+        </w:rPr>
+        <w:t xml:space="preserve">Laundry</w:t>
+      </w:r>
+    </w:p>
+    <w:p>
+      <w:pPr>
+        <w:pStyle w:val="ListParagraph"/>
+        <w:numPr>
+          <w:ilvl w:val="0"/>
+          <w:numId w:val="16"/>
+        </w:numPr>
+        <w:spacing w:after="60"/>
+        <w:rPr>
+          <w:rFonts w:ascii="Arial" w:hAnsi="Arial" w:cs="Arial"/>
+          <w:sz w:val="24"/>
+          <w:szCs w:val="28"/>
+        </w:rPr>
+      </w:pPr>
+      <w:r>
+        <w:rPr>
+          <w:rFonts w:ascii="Arial" w:hAnsi="Arial" w:cs="Arial"/>
+          <w:sz w:val="24"/>
+          <w:szCs w:val="28"/>
+        </w:rPr>
+        <w:t xml:space="preserve">A washer and dryer are available for guest use.</w:t>
+      </w:r>
+    </w:p>
+    <w:p>
+      <w:pPr>
+        <w:pStyle w:val="ListParagraph"/>
+        <w:numPr>
+          <w:ilvl w:val="0"/>
+          <w:numId w:val="16"/>
+        </w:numPr>
+        <w:spacing w:after="60"/>
+        <w:rPr>
+          <w:rFonts w:ascii="Arial" w:hAnsi="Arial" w:cs="Arial"/>
+          <w:sz w:val="24"/>
+          <w:szCs w:val="28"/>
+        </w:rPr>
+      </w:pPr>
+      <w:r>
+        <w:rPr>
+          <w:rFonts w:ascii="Arial" w:hAnsi="Arial" w:cs="Arial"/>
+          <w:sz w:val="24"/>
+          <w:szCs w:val="28"/>
+        </w:rPr>
+        <w:t xml:space="preserve">The laundry area is located inside the home. Detergent is provided.</w:t>
+      </w:r>
+    </w:p>
+    <w:p>
+      <w:pPr>
+        <w:pStyle w:val="ListParagraph"/>
+        <w:numPr>
+          <w:ilvl w:val="0"/>
+          <w:numId w:val="16"/>
+        </w:numPr>
+        <w:spacing w:after="60"/>
+        <w:rPr>
+          <w:rFonts w:ascii="Arial" w:hAnsi="Arial" w:cs="Arial"/>
+          <w:sz w:val="24"/>
+          <w:szCs w:val="28"/>
+        </w:rPr>
+      </w:pPr>
+      <w:r>
+        <w:rPr>
+          <w:rFonts w:ascii="Arial" w:hAnsi="Arial" w:cs="Arial"/>
+          <w:sz w:val="24"/>
+          <w:szCs w:val="28"/>
+        </w:rPr>
+        <w:t xml:space="preserve">Please clean the lint trap after each dryer load.</w:t>
+      </w:r>
+    </w:p>
+    <w:p>
+      <w:pPr>
+        <w:pStyle w:val="Heading1"/>
+        <w:rPr>
+          <w:rFonts w:ascii="Arial" w:hAnsi="Arial" w:cs="Arial"/>
+        </w:rPr>
+      </w:pPr>
       <w:bookmarkStart w:id="6" w:name="_Toc226752872"/>
       <w:r>
         <w:rPr>
@@ -2521,6 +2888,153 @@
           <w:rFonts w:ascii="Arial" w:hAnsi="Arial" w:cs="Arial"/>
         </w:rPr>
       </w:pPr>
+      <w:r>
+        <w:rPr>
+          <w:rFonts w:ascii="Arial" w:hAnsi="Arial" w:cs="Arial"/>
+        </w:rPr>
+        <w:t xml:space="preserve">Septic-Safe Home</w:t>
+      </w:r>
+    </w:p>
+    <w:p>
+      <w:pPr>
+        <w:jc w:val="center"/>
+        <w:rPr>
+          <w:rFonts w:ascii="Arial" w:hAnsi="Arial" w:cs="Arial"/>
+          <w:b/>
+          <w:sz w:val="24"/>
+        </w:rPr>
+      </w:pPr>
+      <w:r>
+        <w:rPr>
+          <w:rFonts w:ascii="Arial" w:hAnsi="Arial" w:cs="Arial"/>
+          <w:b/>
+          <w:sz w:val="24"/>
+        </w:rPr>
+        <w:t xml:space="preserve">This property uses a septic system. Please help us protect it by following these guidelines:</w:t>
+      </w:r>
+    </w:p>
+    <w:p>
+      <w:pPr>
+        <w:pStyle w:val="ListParagraph"/>
+        <w:numPr>
+          <w:ilvl w:val="0"/>
+          <w:numId w:val="16"/>
+        </w:numPr>
+        <w:spacing w:after="60"/>
+        <w:rPr>
+          <w:rFonts w:ascii="Arial" w:hAnsi="Arial" w:cs="Arial"/>
+          <w:sz w:val="24"/>
+          <w:szCs w:val="28"/>
+        </w:rPr>
+      </w:pPr>
+      <w:r>
+        <w:rPr>
+          <w:rFonts w:ascii="Arial" w:hAnsi="Arial" w:cs="Arial"/>
+          <w:sz w:val="24"/>
+          <w:szCs w:val="28"/>
+        </w:rPr>
+        <w:t xml:space="preserve">Do not flush wipes of any kind, including those labeled flushable.</w:t>
+      </w:r>
+    </w:p>
+    <w:p>
+      <w:pPr>
+        <w:pStyle w:val="ListParagraph"/>
+        <w:numPr>
+          <w:ilvl w:val="0"/>
+          <w:numId w:val="16"/>
+        </w:numPr>
+        <w:spacing w:after="60"/>
+        <w:rPr>
+          <w:rFonts w:ascii="Arial" w:hAnsi="Arial" w:cs="Arial"/>
+          <w:sz w:val="24"/>
+          <w:szCs w:val="28"/>
+        </w:rPr>
+      </w:pPr>
+      <w:r>
+        <w:rPr>
+          <w:rFonts w:ascii="Arial" w:hAnsi="Arial" w:cs="Arial"/>
+          <w:sz w:val="24"/>
+          <w:szCs w:val="28"/>
+        </w:rPr>
+        <w:t xml:space="preserve">Do not flush feminine hygiene products, cotton balls, or dental floss.</w:t>
+      </w:r>
+    </w:p>
+    <w:p>
+      <w:pPr>
+        <w:pStyle w:val="ListParagraph"/>
+        <w:numPr>
+          <w:ilvl w:val="0"/>
+          <w:numId w:val="16"/>
+        </w:numPr>
+        <w:spacing w:after="60"/>
+        <w:rPr>
+          <w:rFonts w:ascii="Arial" w:hAnsi="Arial" w:cs="Arial"/>
+          <w:sz w:val="24"/>
+          <w:szCs w:val="28"/>
+        </w:rPr>
+      </w:pPr>
+      <w:r>
+        <w:rPr>
+          <w:rFonts w:ascii="Arial" w:hAnsi="Arial" w:cs="Arial"/>
+          <w:sz w:val="24"/>
+          <w:szCs w:val="28"/>
+        </w:rPr>
+        <w:t xml:space="preserve">Do not pour cooking grease, oil, or food scraps down any drain.</w:t>
+      </w:r>
+    </w:p>
+    <w:p>
+      <w:pPr>
+        <w:pStyle w:val="ListParagraph"/>
+        <w:numPr>
+          <w:ilvl w:val="0"/>
+          <w:numId w:val="16"/>
+        </w:numPr>
+        <w:spacing w:after="60"/>
+        <w:rPr>
+          <w:rFonts w:ascii="Arial" w:hAnsi="Arial" w:cs="Arial"/>
+          <w:sz w:val="24"/>
+          <w:szCs w:val="28"/>
+        </w:rPr>
+      </w:pPr>
+      <w:r>
+        <w:rPr>
+          <w:rFonts w:ascii="Arial" w:hAnsi="Arial" w:cs="Arial"/>
+          <w:sz w:val="24"/>
+          <w:szCs w:val="28"/>
+        </w:rPr>
+        <w:t xml:space="preserve">Avoid using harsh chemical cleaners such as bleach or drain openers.</w:t>
+      </w:r>
+    </w:p>
+    <w:p>
+      <w:pPr>
+        <w:pStyle w:val="ListParagraph"/>
+        <w:numPr>
+          <w:ilvl w:val="0"/>
+          <w:numId w:val="16"/>
+        </w:numPr>
+        <w:spacing w:after="60"/>
+        <w:rPr>
+          <w:rFonts w:ascii="Arial" w:hAnsi="Arial" w:cs="Arial"/>
+          <w:sz w:val="24"/>
+          <w:szCs w:val="28"/>
+        </w:rPr>
+      </w:pPr>
+      <w:r>
+        <w:rPr>
+          <w:rFonts w:ascii="Arial" w:hAnsi="Arial" w:cs="Arial"/>
+          <w:sz w:val="24"/>
+          <w:szCs w:val="28"/>
+        </w:rPr>
+        <w:t xml:space="preserve">Only flush toilet paper. When in doubt, use the trash can.</w:t>
+      </w:r>
+    </w:p>
+    <w:p>
+      <w:pPr>
+        <w:pStyle w:val="Heading1"/>
+        <w:rPr>
+          <w:rFonts w:ascii="Arial" w:hAnsi="Arial" w:cs="Arial"/>
+        </w:rPr>
+      </w:pPr>
       <w:bookmarkStart w:id="7" w:name="_Toc226752873"/>
       <w:r>
         <w:rPr>
@@ -2762,6 +3276,60 @@
     </w:p>
     <w:p>
       <w:pPr>
+        <w:rPr>
+          <w:rFonts w:ascii="Arial" w:hAnsi="Arial" w:cs="Arial"/>
+          <w:sz w:val="24"/>
+          <w:szCs w:val="28"/>
+        </w:rPr>
+        <w:pStyle w:val="Normal"/>
+      </w:pPr>
+      <w:r>
+        <w:rPr>
+          <w:rFonts w:ascii="Arial" w:hAnsi="Arial" w:cs="Arial"/>
+          <w:sz w:val="24"/>
+          <w:szCs w:val="28"/>
+        </w:rPr>
+        <w:t xml:space="preserve">The nearest hospital is Freestone Medical Center, approximately 5 minutes from the property at 125 Newman St, Fairfield, TX 75840.</w:t>
+      </w:r>
+    </w:p>
+    <w:p>
+      <w:pPr>
+        <w:rPr>
+          <w:rFonts w:ascii="Arial" w:hAnsi="Arial" w:cs="Arial"/>
+          <w:sz w:val="24"/>
+          <w:szCs w:val="28"/>
+        </w:rPr>
+        <w:pStyle w:val="Normal"/>
+      </w:pPr>
+      <w:r>
+        <w:rPr>
+          <w:rFonts w:ascii="Arial" w:hAnsi="Arial" w:cs="Arial"/>
+          <w:sz w:val="24"/>
+          <w:szCs w:val="28"/>
+        </w:rPr>
+        <w:t xml:space="preserve">Freestone County Sheriff non-emergency line: (903) 389-3236.</w:t>
+      </w:r>
+    </w:p>
+    <w:p>
+      <w:pPr>
+        <w:rPr>
+          <w:rFonts w:ascii="Arial" w:hAnsi="Arial" w:cs="Arial"/>
+          <w:sz w:val="24"/>
+          <w:szCs w:val="28"/>
+        </w:rPr>
+        <w:pStyle w:val="Normal"/>
+      </w:pPr>
+      <w:r>
+        <w:rPr>
+          <w:rFonts w:ascii="Arial" w:hAnsi="Arial" w:cs="Arial"/>
+          <w:sz w:val="24"/>
+          <w:szCs w:val="28"/>
+        </w:rPr>
+        <w:t xml:space="preserve">Cell service can be limited in rural areas. Starlink WiFi supports WiFi calling if your signal is weak.</w:t>
+      </w:r>
+    </w:p>
+    <w:p>
+      <w:pPr>
         <w:pStyle w:val="Heading1"/>
         <w:rPr>
           <w:rFonts w:ascii="Arial" w:hAnsi="Arial" w:cs="Arial"/>
@@ -2912,6 +3480,29 @@
           <w:szCs w:val="28"/>
         </w:rPr>
         <w:t>Turn off lights, lock the doors, and as much as possible leave the property as you found it.</w:t>
+      </w:r>
+    </w:p>
+    <w:p>
+      <w:pPr>
+        <w:pStyle w:val="ListParagraph"/>
+        <w:numPr>
+          <w:ilvl w:val="0"/>
+          <w:numId w:val="27"/>
+        </w:numPr>
+        <w:spacing w:after="60"/>
+        <w:rPr>
+          <w:rFonts w:ascii="Arial" w:hAnsi="Arial" w:cs="Arial"/>
+          <w:sz w:val="24"/>
+          <w:szCs w:val="28"/>
+        </w:rPr>
+      </w:pPr>
+      <w:r>
+        <w:rPr>
+          <w:rFonts w:ascii="Arial" w:hAnsi="Arial" w:cs="Arial"/>
+          <w:sz w:val="24"/>
+          <w:szCs w:val="28"/>
+        </w:rPr>
+        <w:t xml:space="preserve">Set the thermostat to 78°F in summer or 55°F in winter before leaving.</w:t>
       </w:r>
     </w:p>
     <w:p>

</xml_diff>

<commit_message>
Add Primo water dispenser info to Kitchen section
</commit_message>
<xml_diff>
--- a/docs/Kengs_Landing_Guest_Book.docx
+++ b/docs/Kengs_Landing_Guest_Book.docx
@@ -2237,6 +2237,24 @@
           <w:rFonts w:ascii="Arial" w:hAnsi="Arial" w:cs="Arial"/>
         </w:rPr>
         <w:t xml:space="preserve">A coffee maker is available on the counter. Filters and a small supply of coffee are provided.</w:t>
+      </w:r>
+    </w:p>
+    <w:p>
+      <w:pPr>
+        <w:jc w:val="center"/>
+        <w:rPr>
+          <w:rFonts w:ascii="Arial" w:hAnsi="Arial" w:cs="Arial"/>
+          <w:b/>
+          <w:sz w:val="24"/>
+        </w:rPr>
+      </w:pPr>
+      <w:r>
+        <w:rPr>
+          <w:rFonts w:ascii="Arial" w:hAnsi="Arial" w:cs="Arial"/>
+          <w:b/>
+          <w:sz w:val="24"/>
+        </w:rPr>
+        <w:t xml:space="preserve">A Primo filtered water dispenser is available in the kitchen for drinking, coffee, and cooking. It provides clean, great-tasting filtered water — one of those small touches that makes a stay feel a little more like home. If you’d like hot or cold water, there are two switches on the back of the dispenser to turn those features on. Feel free to use them during your stay.</w:t>
       </w:r>
     </w:p>
     <w:p>

</xml_diff>

<commit_message>
Update guest book docx with fireplace, outdoor lighting, and jacuzzi details
</commit_message>
<xml_diff>
--- a/docs/Kengs_Landing_Guest_Book.docx
+++ b/docs/Kengs_Landing_Guest_Book.docx
@@ -2606,46 +2606,7 @@
         </w:rPr>
       </w:pPr>
       <w:r>
-        <w:rPr>
-          <w:rFonts w:ascii="Arial" w:hAnsi="Arial" w:cs="Arial"/>
-        </w:rPr>
-        <w:t xml:space="preserve">The home has central air conditioning controlled by a thermostat </w:t>
-      </w:r>
-      <w:r>
-        <w:rPr>
-          <w:rFonts w:ascii="Arial" w:hAnsi="Arial" w:cs="Arial"/>
-        </w:rPr>
-        <w:t>by</w:t>
-      </w:r>
-      <w:r>
-        <w:rPr>
-          <w:rFonts w:ascii="Arial" w:hAnsi="Arial" w:cs="Arial"/>
-        </w:rPr>
-        <w:t xml:space="preserve"> the</w:t>
-      </w:r>
-      <w:r>
-        <w:rPr>
-          <w:rFonts w:ascii="Arial" w:hAnsi="Arial" w:cs="Arial"/>
-        </w:rPr>
-        <w:t xml:space="preserve"> front</w:t>
-      </w:r>
-      <w:r>
-        <w:rPr>
-          <w:rFonts w:ascii="Arial" w:hAnsi="Arial" w:cs="Arial"/>
-        </w:rPr>
-        <w:t xml:space="preserve"> </w:t>
-      </w:r>
-      <w:r>
-        <w:rPr>
-          <w:rFonts w:ascii="Arial" w:hAnsi="Arial" w:cs="Arial"/>
-        </w:rPr>
-        <w:t>entrance</w:t>
-      </w:r>
-      <w:r>
-        <w:rPr>
-          <w:rFonts w:ascii="Arial" w:hAnsi="Arial" w:cs="Arial"/>
-        </w:rPr>
-        <w:t>. Please set it to a comfortable temperature and avoid setting it below 68°F in summer.</w:t>
+        <w:t>The home has central air conditioning controlled by a thermostat by the front entrance. Please set it to a comfortable temperature and avoid setting it below 68°F in summer.</w:t>
       </w:r>
     </w:p>
     <w:p>
@@ -2656,112 +2617,7 @@
         </w:rPr>
       </w:pPr>
       <w:r>
-        <w:rPr>
-          <w:rFonts w:ascii="Arial" w:hAnsi="Arial" w:cs="Arial"/>
-        </w:rPr>
-        <w:t xml:space="preserve">A propane heater is available in the living room for cooler evenings. Instructions </w:t>
-      </w:r>
-      <w:r>
-        <w:rPr>
-          <w:rFonts w:ascii="Arial" w:hAnsi="Arial" w:cs="Arial"/>
-        </w:rPr>
-        <w:t>are</w:t>
-      </w:r>
-      <w:r>
-        <w:rPr>
-          <w:rFonts w:ascii="Arial" w:hAnsi="Arial" w:cs="Arial"/>
-        </w:rPr>
-        <w:t xml:space="preserve"> posted</w:t>
-      </w:r>
-      <w:r>
-        <w:rPr>
-          <w:rFonts w:ascii="Arial" w:hAnsi="Arial" w:cs="Arial"/>
-        </w:rPr>
-        <w:t xml:space="preserve"> under</w:t>
-      </w:r>
-      <w:r>
-        <w:rPr>
-          <w:rFonts w:ascii="Arial" w:hAnsi="Arial" w:cs="Arial"/>
-        </w:rPr>
-        <w:t xml:space="preserve"> the unit</w:t>
-      </w:r>
-      <w:r>
-        <w:rPr>
-          <w:rFonts w:ascii="Arial" w:hAnsi="Arial" w:cs="Arial"/>
-        </w:rPr>
-        <w:t xml:space="preserve"> where the controls are located</w:t>
-      </w:r>
-      <w:r>
-        <w:rPr>
-          <w:rFonts w:ascii="Arial" w:hAnsi="Arial" w:cs="Arial"/>
-        </w:rPr>
-        <w:t>.</w:t>
-      </w:r>
-      <w:r>
-        <w:rPr>
-          <w:rFonts w:ascii="Arial" w:hAnsi="Arial" w:cs="Arial"/>
-        </w:rPr>
-        <w:t xml:space="preserve"> Please contact us if you have any questions.</w:t>
-      </w:r>
-      <w:r>
-        <w:rPr>
-          <w:rFonts w:ascii="Arial" w:hAnsi="Arial" w:cs="Arial"/>
-        </w:rPr>
-        <w:t xml:space="preserve"> Please turn it off before going to bed or leaving the property.</w:t>
-      </w:r>
-      <w:r>
-        <w:rPr>
-          <w:rFonts w:ascii="Arial" w:hAnsi="Arial" w:cs="Arial"/>
-        </w:rPr>
-        <w:t xml:space="preserve"> There are also </w:t>
-      </w:r>
-      <w:r>
-        <w:rPr>
-          <w:rFonts w:ascii="Arial" w:hAnsi="Arial" w:cs="Arial"/>
-        </w:rPr>
-        <w:t>c</w:t>
-      </w:r>
-      <w:r>
-        <w:rPr>
-          <w:rFonts w:ascii="Arial" w:hAnsi="Arial" w:cs="Arial"/>
-        </w:rPr>
-        <w:t xml:space="preserve">arbon </w:t>
-      </w:r>
-      <w:r>
-        <w:rPr>
-          <w:rFonts w:ascii="Arial" w:hAnsi="Arial" w:cs="Arial"/>
-        </w:rPr>
-        <w:t>m</w:t>
-      </w:r>
-      <w:r>
-        <w:rPr>
-          <w:rFonts w:ascii="Arial" w:hAnsi="Arial" w:cs="Arial"/>
-        </w:rPr>
-        <w:t xml:space="preserve">onoxide and </w:t>
-      </w:r>
-      <w:r>
-        <w:rPr>
-          <w:rFonts w:ascii="Arial" w:hAnsi="Arial" w:cs="Arial"/>
-        </w:rPr>
-        <w:t>s</w:t>
-      </w:r>
-      <w:r>
-        <w:rPr>
-          <w:rFonts w:ascii="Arial" w:hAnsi="Arial" w:cs="Arial"/>
-        </w:rPr>
-        <w:t xml:space="preserve">moke </w:t>
-      </w:r>
-      <w:r>
-        <w:rPr>
-          <w:rFonts w:ascii="Arial" w:hAnsi="Arial" w:cs="Arial"/>
-        </w:rPr>
-        <w:t>d</w:t>
-      </w:r>
-      <w:r>
-        <w:rPr>
-          <w:rFonts w:ascii="Arial" w:hAnsi="Arial" w:cs="Arial"/>
-        </w:rPr>
-        <w:t>etectors throughout the house to ensure everyone’s safety.</w:t>
+        <w:t>Propane Fireplace (Living Room): The propane supply valve is at the bottom of the unit. To light it: turn the knob to Pilot mode, hold the knob down for about 5 seconds, then click the starter button while still holding. Once the pilot catches, hold a few more seconds, release, and turn the knob to a higher setting. If it doesn't catch, repeat the process. The 1–5 dial is temperature-based: the fireplace turns on and off automatically based on room temperature. We recommend setting it between 2–3. Setting 5 runs continuously and pumps out a lot of heat. Please turn it off before going to bed or leaving the property.</w:t>
       </w:r>
     </w:p>
     <w:p>
@@ -2772,10 +2628,7 @@
         </w:rPr>
       </w:pPr>
       <w:r>
-        <w:rPr>
-          <w:rFonts w:ascii="Arial" w:hAnsi="Arial" w:cs="Arial"/>
-        </w:rPr>
-        <w:t>Ceiling fans are available in the bedrooms and living room to help with airflow.</w:t>
+        <w:t>Electric Fireplaces (Bedrooms): Plug the unit in — you may hear a beep confirming power. Look for a small metal grate on the top-right of the unit. Under that grate is the power button — press it to turn on. There is a second button for High/Low heat. If the unit seems unresponsive, look for a reset button on the back or underside and press it, then try the power button again.</w:t>
       </w:r>
     </w:p>
     <w:p>
@@ -2785,14 +2638,21 @@
           <w:rFonts w:ascii="Arial" w:hAnsi="Arial" w:cs="Arial"/>
         </w:rPr>
       </w:pPr>
+      <w:r>
+        <w:t>Ceiling fans are available in the bedrooms and living room to help with airflow. Carbon monoxide and smoke detectors are installed throughout the house for safety.</w:t>
+      </w:r>
     </w:p>
     <w:p>
       <w:pPr>
+        <w:pStyle w:val="Heading1"/>
         <w:spacing w:after="200" w:line="276" w:lineRule="auto"/>
         <w:rPr>
           <w:rFonts w:ascii="Arial" w:hAnsi="Arial" w:cs="Arial"/>
         </w:rPr>
       </w:pPr>
+      <w:r>
+        <w:t>Outdoor Lighting</w:t>
+      </w:r>
     </w:p>
     <w:p>
       <w:pPr>
@@ -2801,6 +2661,9 @@
           <w:rFonts w:ascii="Arial" w:hAnsi="Arial" w:cs="Arial"/>
         </w:rPr>
       </w:pPr>
+      <w:r>
+        <w:t>The main power switch for the back porch is on the pine wall behind the TV inside the house. Flip it on and the bug zappers will come on automatically.</w:t>
+      </w:r>
     </w:p>
     <w:p>
       <w:pPr>
@@ -2809,6 +2672,9 @@
           <w:rFonts w:ascii="Arial" w:hAnsi="Arial" w:cs="Arial"/>
         </w:rPr>
       </w:pPr>
+      <w:r>
+        <w:t>For the patio string lights, there are pull-chain switches outside on the porch. Turn on the main switch inside first, then use the pull switches to control individual patio lights.</w:t>
+      </w:r>
     </w:p>
     <w:p>
       <w:pPr>
@@ -3049,18 +2915,12 @@
           <w:rFonts w:ascii="Arial" w:hAnsi="Arial" w:cs="Arial"/>
         </w:rPr>
       </w:pPr>
-      <w:bookmarkStart w:id="8" w:name="_Toc226755976"/>
       <w:r>
-        <w:rPr>
-          <w:rFonts w:ascii="Arial" w:hAnsi="Arial" w:cs="Arial"/>
-        </w:rPr>
-        <w:t>Hot Tub Guidelines</w:t>
+        <w:t>Hydrotherapy Jacuzzi</w:t>
       </w:r>
-      <w:bookmarkEnd w:id="8"/>
     </w:p>
     <w:p>
       <w:pPr>
-        <w:pStyle w:val="ListParagraph"/>
         <w:numPr>
           <w:ilvl w:val="0"/>
           <w:numId w:val="20"/>
@@ -3073,17 +2933,11 @@
         </w:rPr>
       </w:pPr>
       <w:r>
-        <w:rPr>
-          <w:rFonts w:ascii="Arial" w:hAnsi="Arial" w:cs="Arial"/>
-          <w:sz w:val="24"/>
-          <w:szCs w:val="28"/>
-        </w:rPr>
-        <w:t>Please enjoy the hot tub responsibly.</w:t>
+        <w:t>This isn't a standard hot tub — it's a premium hydrotherapy massage jacuzzi. Five dedicated seats across four distinct zones, three independent jet systems, and individual throttle controls per zone. Take your time with it.</w:t>
       </w:r>
     </w:p>
     <w:p>
       <w:pPr>
-        <w:pStyle w:val="ListParagraph"/>
         <w:numPr>
           <w:ilvl w:val="0"/>
           <w:numId w:val="20"/>
@@ -3096,17 +2950,11 @@
         </w:rPr>
       </w:pPr>
       <w:r>
-        <w:rPr>
-          <w:rFonts w:ascii="Arial" w:hAnsi="Arial" w:cs="Arial"/>
-          <w:sz w:val="24"/>
-          <w:szCs w:val="28"/>
-        </w:rPr>
-        <w:t>No glass containers in or around the hot tub area.</w:t>
+        <w:t>Seating: The love seat (2 people) and front single seat share one jet zone with a sideways throttle knob near the love seat to direct flow between them — we keep it in the middle. There are also foot jets between these two seats. The therapy seat (across from the control panel) has its own independent zone controlled by Jets 3 (On/Off) with its own throttle — the 2nd most powerful position. The control panel seat is the deepest with the most powerful jets, its own throttle, and multiple knobs to direct individual jets exactly where you need them.</w:t>
       </w:r>
     </w:p>
     <w:p>
       <w:pPr>
-        <w:pStyle w:val="ListParagraph"/>
         <w:numPr>
           <w:ilvl w:val="0"/>
           <w:numId w:val="20"/>
@@ -3119,35 +2967,11 @@
         </w:rPr>
       </w:pPr>
       <w:r>
-        <w:rPr>
-          <w:rFonts w:ascii="Arial" w:hAnsi="Arial" w:cs="Arial"/>
-          <w:sz w:val="24"/>
-          <w:szCs w:val="28"/>
-        </w:rPr>
-        <w:t xml:space="preserve">Children must be </w:t>
-      </w:r>
-      <w:proofErr w:type="gramStart"/>
-      <w:r>
-        <w:rPr>
-          <w:rFonts w:ascii="Arial" w:hAnsi="Arial" w:cs="Arial"/>
-          <w:sz w:val="24"/>
-          <w:szCs w:val="28"/>
-        </w:rPr>
-        <w:t>supervised at all times</w:t>
-      </w:r>
-      <w:proofErr w:type="gramEnd"/>
-      <w:r>
-        <w:rPr>
-          <w:rFonts w:ascii="Arial" w:hAnsi="Arial" w:cs="Arial"/>
-          <w:sz w:val="24"/>
-          <w:szCs w:val="28"/>
-        </w:rPr>
-        <w:t>.</w:t>
+        <w:t>Controls: Jets 1 has High/Low toggle. Jets 2 is On/Off. Jets 3 controls the therapy seat (On/Off). Important: the Blower and Lights buttons are swapped — press "Blower" for lights, press "Lights" for the bubble feature. There are tons of switches, toggles, and dials all around the tub — explore and find your setup.</w:t>
       </w:r>
     </w:p>
     <w:p>
       <w:pPr>
-        <w:pStyle w:val="ListParagraph"/>
         <w:numPr>
           <w:ilvl w:val="0"/>
           <w:numId w:val="20"/>
@@ -3160,35 +2984,11 @@
         </w:rPr>
       </w:pPr>
       <w:r>
-        <w:rPr>
-          <w:rFonts w:ascii="Arial" w:hAnsi="Arial" w:cs="Arial"/>
-          <w:sz w:val="24"/>
-          <w:szCs w:val="28"/>
-        </w:rPr>
-        <w:t xml:space="preserve">Shower before entering when </w:t>
-      </w:r>
-      <w:proofErr w:type="gramStart"/>
-      <w:r>
-        <w:rPr>
-          <w:rFonts w:ascii="Arial" w:hAnsi="Arial" w:cs="Arial"/>
-          <w:sz w:val="24"/>
-          <w:szCs w:val="28"/>
-        </w:rPr>
-        <w:t>possible, and</w:t>
-      </w:r>
-      <w:proofErr w:type="gramEnd"/>
-      <w:r>
-        <w:rPr>
-          <w:rFonts w:ascii="Arial" w:hAnsi="Arial" w:cs="Arial"/>
-          <w:sz w:val="24"/>
-          <w:szCs w:val="28"/>
-        </w:rPr>
-        <w:t xml:space="preserve"> replace the cover after use.</w:t>
+        <w:t>Temperature: The jacuzzi goes up to 104°F but that's intense — you'll last about 5 minutes. We recommend 100–101°F for longer sessions (you'll still want to sit on the edge to cool down). We keep it at 98°F when not in use. It heats about 2°F per hour with the lid closed, so plan ahead. If you set it too high, it takes a while to cool back down.</w:t>
       </w:r>
     </w:p>
     <w:p>
       <w:pPr>
-        <w:pStyle w:val="ListParagraph"/>
         <w:numPr>
           <w:ilvl w:val="0"/>
           <w:numId w:val="20"/>
@@ -3200,12 +3000,7 @@
         </w:rPr>
       </w:pPr>
       <w:r>
-        <w:rPr>
-          <w:rFonts w:ascii="Arial" w:hAnsi="Arial" w:cs="Arial"/>
-          <w:sz w:val="24"/>
-          <w:szCs w:val="28"/>
-        </w:rPr>
-        <w:t>Follow any posted instructions near the hot tub.</w:t>
+        <w:t>Before You Get In: Please rinse off before getting in — body oils, sunscreen, and lotions cause foaming and make maintenance harder. Just throw on your swimsuit, rinse in the indoor shower, and walk out. The Lid: A metal assist bar helps guide the cover on and off. A bench stand at the back catches the lid when you flip it up. Lift evenly from the center to avoid bending the bar (it's been repaired once). The cover has cosmetic tears on the outside but the inner foam has been resealed. No glass near the tub. Children must be supervised. Always replace the cover when done.</w:t>
       </w:r>
     </w:p>
     <w:p>

</xml_diff>